<commit_message>
Fix SIWES report cover pages and numbering
Co-authored-by: arena-agent <297053741+arena-agent@users.noreply.github.com>
</commit_message>
<xml_diff>
--- a/NEW/SIWES_Report_AGULE_JEROME_IORCHIR.docx
+++ b/NEW/SIWES_Report_AGULE_JEROME_IORCHIR.docx
@@ -4,118 +4,146 @@
   <w:body>
     <w:p>
       <w:pPr>
+        <w:spacing w:before="0" w:after="160" w:line="276" w:lineRule="auto"/>
         <w:jc w:val="center"/>
       </w:pPr>
       <w:r>
         <w:rPr>
           <w:b/>
           <w:bCs/>
+          <w:sz w:val="24"/>
         </w:rPr>
         <w:t>JOSEPH SARWUAN TARKA UNIVERSITY, MAKURDI</w:t>
       </w:r>
     </w:p>
     <w:p>
       <w:pPr>
+        <w:spacing w:before="0" w:after="160" w:line="276" w:lineRule="auto"/>
         <w:jc w:val="center"/>
       </w:pPr>
       <w:r>
         <w:rPr>
           <w:b/>
           <w:bCs/>
+          <w:sz w:val="24"/>
         </w:rPr>
         <w:t>COLLEGE OF FORESTRY AND FISHERIES</w:t>
       </w:r>
     </w:p>
     <w:p>
       <w:pPr>
+        <w:spacing w:before="0" w:after="160" w:line="276" w:lineRule="auto"/>
         <w:jc w:val="center"/>
       </w:pPr>
       <w:r>
         <w:rPr>
           <w:b/>
           <w:bCs/>
+          <w:sz w:val="24"/>
         </w:rPr>
         <w:t>DEPARTMENT OF SOCIAL AND ENVIRONMENTAL FORESTRY</w:t>
       </w:r>
     </w:p>
     <w:p>
       <w:pPr>
-        <w:spacing w:before="2400"/>
+        <w:spacing w:before="1080" w:after="160" w:line="276" w:lineRule="auto"/>
         <w:jc w:val="center"/>
       </w:pPr>
       <w:r>
         <w:rPr>
           <w:b/>
           <w:bCs/>
+          <w:sz w:val="24"/>
         </w:rPr>
         <w:t>STUDENTS INDUSTRIAL WORK EXPERIENCE SCHEME (SIWES)</w:t>
       </w:r>
     </w:p>
     <w:p>
       <w:pPr>
+        <w:spacing w:before="0" w:after="160" w:line="276" w:lineRule="auto"/>
         <w:jc w:val="center"/>
       </w:pPr>
       <w:r>
         <w:rPr>
           <w:b/>
           <w:bCs/>
+          <w:sz w:val="24"/>
         </w:rPr>
         <w:t>REPORT</w:t>
       </w:r>
     </w:p>
     <w:p>
       <w:pPr>
-        <w:spacing w:before="2400"/>
+        <w:spacing w:before="840" w:after="160" w:line="276" w:lineRule="auto"/>
         <w:jc w:val="center"/>
       </w:pPr>
       <w:r>
         <w:rPr>
           <w:b/>
           <w:bCs/>
+          <w:sz w:val="24"/>
         </w:rPr>
         <w:t>BY</w:t>
       </w:r>
     </w:p>
     <w:p>
       <w:pPr>
+        <w:spacing w:before="0" w:after="160" w:line="276" w:lineRule="auto"/>
         <w:jc w:val="center"/>
       </w:pPr>
       <w:r>
         <w:rPr>
           <w:b/>
           <w:bCs/>
+          <w:sz w:val="24"/>
         </w:rPr>
         <w:t>AGULE JEROME IORCHIR</w:t>
       </w:r>
     </w:p>
     <w:p>
       <w:pPr>
+        <w:spacing w:before="0" w:after="160" w:line="276" w:lineRule="auto"/>
         <w:jc w:val="center"/>
       </w:pPr>
       <w:r>
         <w:rPr>
           <w:b/>
           <w:bCs/>
+          <w:sz w:val="24"/>
         </w:rPr>
         <w:t>22/57223/UE</w:t>
       </w:r>
     </w:p>
     <w:p>
       <w:pPr>
-        <w:spacing w:before="2600"/>
+        <w:spacing w:before="960" w:after="160" w:line="276" w:lineRule="auto"/>
         <w:jc w:val="center"/>
       </w:pPr>
       <w:r>
         <w:rPr>
           <w:b/>
           <w:bCs/>
+          <w:sz w:val="24"/>
         </w:rPr>
         <w:t>OCTOBER, 2026</w:t>
       </w:r>
     </w:p>
     <w:p>
       <w:pPr>
-        <w:pageBreakBefore/>
+        <w:sectPr>
+          <w:footerReference w:type="default" r:id="rId19"/>
+          <w:type w:val="nextPage"/>
+          <w:pgSz w:w="11906" w:h="16838"/>
+          <w:pgMar w:top="1440" w:right="1440" w:bottom="1440" w:left="1800" w:header="708" w:footer="700" w:gutter="0"/>
+          <w:cols w:space="720"/>
+          <w:docGrid w:linePitch="360"/>
+        </w:sectPr>
+      </w:pPr>
+    </w:p>
+    <w:p>
+      <w:pPr>
+        <w:pageBreakBefore w:val="0"/>
+        <w:spacing w:before="640" w:after="160" w:line="276" w:lineRule="auto"/>
         <w:jc w:val="center"/>
       </w:pPr>
       <w:fldSimple w:instr=" TC &quot;TITLE PAGE&quot; \f t \l 1 "/>
@@ -123,64 +151,70 @@
         <w:rPr>
           <w:b/>
           <w:bCs/>
+          <w:sz w:val="24"/>
         </w:rPr>
-        <w:lastRenderedPageBreak/>
         <w:t>STUDENTS INDUSTRIAL WORK EXPERIENCE SCHEME (SIWES) REPORT</w:t>
       </w:r>
     </w:p>
     <w:p>
       <w:pPr>
-        <w:spacing w:before="2400"/>
+        <w:spacing w:before="880" w:after="160" w:line="276" w:lineRule="auto"/>
         <w:jc w:val="center"/>
       </w:pPr>
       <w:r>
         <w:rPr>
           <w:b/>
           <w:bCs/>
+          <w:sz w:val="24"/>
         </w:rPr>
         <w:t>BY</w:t>
       </w:r>
     </w:p>
     <w:p>
       <w:pPr>
+        <w:spacing w:before="0" w:after="160" w:line="276" w:lineRule="auto"/>
         <w:jc w:val="center"/>
       </w:pPr>
       <w:r>
         <w:rPr>
           <w:b/>
           <w:bCs/>
+          <w:sz w:val="24"/>
         </w:rPr>
         <w:t>AGULE JEROME IORCHIR</w:t>
       </w:r>
     </w:p>
     <w:p>
       <w:pPr>
+        <w:spacing w:before="0" w:after="160" w:line="276" w:lineRule="auto"/>
         <w:jc w:val="center"/>
       </w:pPr>
       <w:r>
         <w:rPr>
           <w:b/>
           <w:bCs/>
+          <w:sz w:val="24"/>
         </w:rPr>
         <w:t>22/57223/UE</w:t>
       </w:r>
     </w:p>
     <w:p>
       <w:pPr>
-        <w:spacing w:before="2400"/>
+        <w:spacing w:before="900" w:after="160" w:line="276" w:lineRule="auto"/>
         <w:jc w:val="center"/>
       </w:pPr>
       <w:r>
         <w:rPr>
           <w:b/>
           <w:bCs/>
+          <w:sz w:val="24"/>
         </w:rPr>
         <w:t>SUBMITTED TO THE DEPARTMENT OF SOCIAL AND ENVIRONMENTAL FORESTRY, COLLEGE OF FORESTRY AND FISHERIES, JOSEPH SARWUAN TARKA UNIVERSITY, MAKURDI, IN PARTIAL FULFILMENT OF THE REQUIREMENTS FOR THE AWARD OF B. FORESTRY (SOCIAL AND ENVIRONMENTAL FORESTRY) DEGREE.</w:t>
       </w:r>
     </w:p>
     <w:p>
       <w:pPr>
-        <w:spacing w:before="2400"/>
+        <w:spacing w:before="880" w:after="160" w:line="276" w:lineRule="auto"/>
         <w:jc w:val="center"/>
         <w:rPr>
           <w:b/>
@@ -191,9 +225,8 @@
           <w:footerReference w:type="first" r:id="rId18"/>
           <w:pgSz w:w="11906" w:h="16838"/>
           <w:pgMar w:top="1440" w:right="1440" w:bottom="1440" w:left="1800" w:header="708" w:footer="700" w:gutter="0"/>
-          <w:pgNumType w:fmt="lowerRoman" w:start="0"/>
+          <w:pgNumType w:fmt="lowerRoman" w:start="1"/>
           <w:cols w:space="720"/>
-          <w:titlePg/>
           <w:docGrid w:linePitch="360"/>
         </w:sectPr>
       </w:pPr>
@@ -201,6 +234,7 @@
         <w:rPr>
           <w:b/>
           <w:bCs/>
+          <w:sz w:val="24"/>
         </w:rPr>
         <w:t>OCTOBER, 2026</w:t>
       </w:r>
@@ -845,6 +879,7 @@
     <w:p>
       <w:pPr>
         <w:pStyle w:val="Heading1"/>
+        <w:pageBreakBefore/>
         <w:jc w:val="center"/>
         <w:rPr>
           <w:sz w:val="24"/>
@@ -4051,6 +4086,7 @@
     <w:p>
       <w:pPr>
         <w:pStyle w:val="Heading1"/>
+        <w:pageBreakBefore/>
         <w:jc w:val="center"/>
         <w:rPr>
           <w:sz w:val="24"/>
@@ -5276,372 +5312,10 @@
     <w:p>
       <w:pPr>
         <w:pStyle w:val="Heading2"/>
-        <w:rPr>
-          <w:rFonts w:eastAsia="MS Gothic"/>
-          <w:lang w:val="en-US" w:eastAsia="en-US"/>
-        </w:rPr>
-      </w:pPr>
-      <w:bookmarkStart w:id="14" w:name="_Toc244104014"/>
-      <w:bookmarkStart w:id="15" w:name="_Toc244108855"/>
-      <w:r>
-        <w:rPr>
-          <w:rFonts w:eastAsia="MS Gothic"/>
-          <w:lang w:val="en-US" w:eastAsia="en-US"/>
-        </w:rPr>
-        <w:t>1.5 Functions of the Agencies</w:t>
-      </w:r>
-      <w:bookmarkEnd w:id="14"/>
-      <w:bookmarkEnd w:id="15"/>
-    </w:p>
-    <w:p>
-      <w:pPr>
-        <w:keepNext/>
-        <w:keepLines/>
-        <w:spacing w:before="120" w:after="80" w:line="360" w:lineRule="auto"/>
-        <w:outlineLvl w:val="2"/>
-        <w:rPr>
-          <w:rFonts w:eastAsia="MS Gothic"/>
-          <w:b/>
-          <w:bCs/>
-          <w:color w:val="000000"/>
-          <w:szCs w:val="22"/>
-          <w:lang w:val="en-US" w:eastAsia="en-US"/>
-        </w:rPr>
-      </w:pPr>
-      <w:bookmarkStart w:id="16" w:name="_Toc244104015"/>
-      <w:bookmarkStart w:id="17" w:name="_Toc244108856"/>
-      <w:r>
-        <w:rPr>
-          <w:rFonts w:eastAsia="MS Gothic"/>
-          <w:b/>
-          <w:bCs/>
-          <w:color w:val="000000"/>
-          <w:szCs w:val="22"/>
-          <w:lang w:val="en-US" w:eastAsia="en-US"/>
-        </w:rPr>
-        <w:t>1.5.1 Federal Government of Nigeria</w:t>
-      </w:r>
-      <w:bookmarkEnd w:id="16"/>
-      <w:bookmarkEnd w:id="17"/>
-    </w:p>
-    <w:p>
-      <w:pPr>
-        <w:spacing w:after="80" w:line="360" w:lineRule="auto"/>
-        <w:jc w:val="both"/>
-        <w:rPr>
-          <w:szCs w:val="22"/>
-          <w:lang w:val="en-US" w:eastAsia="en-US"/>
-        </w:rPr>
-      </w:pPr>
-      <w:r>
-        <w:rPr>
-          <w:szCs w:val="22"/>
-          <w:lang w:val="en-US" w:eastAsia="en-US"/>
-        </w:rPr>
-        <w:t>The Federal Government releases the money for the scheme through the Ministry of Industry, Trade and Investment. It also makes it compulsory for ministries, companies and parastatals to accept students for attachment, as provided in the Industrial Training Fund Act of 1971 as amended.</w:t>
-      </w:r>
-    </w:p>
-    <w:p>
-      <w:pPr>
-        <w:keepNext/>
-        <w:keepLines/>
-        <w:spacing w:before="120" w:after="80" w:line="360" w:lineRule="auto"/>
-        <w:outlineLvl w:val="2"/>
-        <w:rPr>
-          <w:rFonts w:eastAsia="MS Gothic"/>
-          <w:b/>
-          <w:bCs/>
-          <w:color w:val="000000"/>
-          <w:szCs w:val="22"/>
-          <w:lang w:val="en-US" w:eastAsia="en-US"/>
-        </w:rPr>
-      </w:pPr>
-      <w:bookmarkStart w:id="18" w:name="_Toc244104016"/>
-      <w:bookmarkStart w:id="19" w:name="_Toc244108857"/>
-      <w:r>
-        <w:rPr>
-          <w:rFonts w:eastAsia="MS Gothic"/>
-          <w:b/>
-          <w:bCs/>
-          <w:color w:val="000000"/>
-          <w:szCs w:val="22"/>
-          <w:lang w:val="en-US" w:eastAsia="en-US"/>
-        </w:rPr>
-        <w:t>1.5.2 The Industrial Training Fund</w:t>
-      </w:r>
-      <w:bookmarkEnd w:id="18"/>
-      <w:bookmarkEnd w:id="19"/>
-    </w:p>
-    <w:p>
-      <w:pPr>
-        <w:spacing w:after="80" w:line="360" w:lineRule="auto"/>
-        <w:jc w:val="both"/>
-        <w:rPr>
-          <w:szCs w:val="22"/>
-          <w:lang w:val="en-US" w:eastAsia="en-US"/>
-        </w:rPr>
-      </w:pPr>
-      <w:r>
-        <w:rPr>
-          <w:szCs w:val="22"/>
-          <w:lang w:val="en-US" w:eastAsia="en-US"/>
-        </w:rPr>
-        <w:t>The Fund makes the policies and guidelines for the scheme and sends them to the bodies, institutions and companies taking part. It organises orientation for students before attachment, receives and processes the master and placement lists through the supervising agencies, and supervises and monitors students while they are attached. It pays the supervisory and students' allowances by e-payment, provides insurance cover, and provides the logistics and materials needed to run the scheme. It also visits the agencies, institutions, employers and students; gives information on companies and helps in placement; organises the biennial SIWES national conference and review meetings; keeps reviewing and researching into the scheme; and vets, processes and verifies students' log books and the ITF form 8.</w:t>
-      </w:r>
-    </w:p>
-    <w:p>
-      <w:pPr>
-        <w:keepNext/>
-        <w:keepLines/>
-        <w:spacing w:before="120" w:after="80" w:line="360" w:lineRule="auto"/>
-        <w:outlineLvl w:val="2"/>
-        <w:rPr>
-          <w:rFonts w:eastAsia="MS Gothic"/>
-          <w:b/>
-          <w:bCs/>
-          <w:color w:val="000000"/>
-          <w:szCs w:val="22"/>
-          <w:lang w:val="en-US" w:eastAsia="en-US"/>
-        </w:rPr>
-      </w:pPr>
-      <w:bookmarkStart w:id="20" w:name="_Toc244104017"/>
-      <w:bookmarkStart w:id="21" w:name="_Toc244108858"/>
-      <w:r>
-        <w:rPr>
-          <w:rFonts w:eastAsia="MS Gothic"/>
-          <w:b/>
-          <w:bCs/>
-          <w:color w:val="000000"/>
-          <w:szCs w:val="22"/>
-          <w:lang w:val="en-US" w:eastAsia="en-US"/>
-        </w:rPr>
-        <w:t>1.5.3 National Universities Commission</w:t>
-      </w:r>
-      <w:bookmarkEnd w:id="20"/>
-      <w:bookmarkEnd w:id="21"/>
-    </w:p>
-    <w:p>
-      <w:pPr>
-        <w:spacing w:after="80" w:line="360" w:lineRule="auto"/>
-        <w:jc w:val="both"/>
-        <w:rPr>
-          <w:szCs w:val="22"/>
-          <w:lang w:val="en-US" w:eastAsia="en-US"/>
-        </w:rPr>
-      </w:pPr>
-      <w:r>
-        <w:rPr>
-          <w:szCs w:val="22"/>
-          <w:lang w:val="en-US" w:eastAsia="en-US"/>
-        </w:rPr>
-        <w:t>The Commission makes sure the scheme is established and accredited in Nigerian universities, appoints full-time SIWES coordinators for them, approves the master and placement lists and forwards them to the Fund, works with the Fund on federal government policy, and keeps the national minimum academic standard for the university programmes that take part.</w:t>
-      </w:r>
-    </w:p>
-    <w:p>
-      <w:pPr>
-        <w:keepNext/>
-        <w:keepLines/>
-        <w:spacing w:before="120" w:after="80" w:line="360" w:lineRule="auto"/>
-        <w:outlineLvl w:val="2"/>
-        <w:rPr>
-          <w:rFonts w:eastAsia="MS Gothic"/>
-          <w:b/>
-          <w:bCs/>
-          <w:color w:val="000000"/>
-          <w:szCs w:val="22"/>
-          <w:lang w:val="en-US" w:eastAsia="en-US"/>
-        </w:rPr>
-      </w:pPr>
-      <w:bookmarkStart w:id="22" w:name="_Toc244104018"/>
-      <w:bookmarkStart w:id="23" w:name="_Toc244108859"/>
-      <w:r>
-        <w:rPr>
-          <w:rFonts w:eastAsia="MS Gothic"/>
-          <w:b/>
-          <w:bCs/>
-          <w:color w:val="000000"/>
-          <w:szCs w:val="22"/>
-          <w:lang w:val="en-US" w:eastAsia="en-US"/>
-        </w:rPr>
-        <w:t>1.5.4 National Board for Technical Education</w:t>
-      </w:r>
-      <w:bookmarkEnd w:id="22"/>
-      <w:bookmarkEnd w:id="23"/>
-    </w:p>
-    <w:p>
-      <w:pPr>
-        <w:spacing w:after="80" w:line="360" w:lineRule="auto"/>
-        <w:jc w:val="both"/>
-        <w:rPr>
-          <w:szCs w:val="22"/>
-          <w:lang w:val="en-US" w:eastAsia="en-US"/>
-        </w:rPr>
-      </w:pPr>
-      <w:r>
-        <w:rPr>
-          <w:szCs w:val="22"/>
-          <w:lang w:val="en-US" w:eastAsia="en-US"/>
-        </w:rPr>
-        <w:t>The Board does the same work for polytechnics and other technical institutions. It sees to the establishment and accreditation of SIWES units, makes sure full-time coordinators are appointed, vets and approves the master and placement lists before sending them to the Fund, and works with the Fund on national policy.</w:t>
-      </w:r>
-    </w:p>
-    <w:p>
-      <w:pPr>
-        <w:keepNext/>
-        <w:keepLines/>
-        <w:spacing w:before="120" w:after="80" w:line="360" w:lineRule="auto"/>
-        <w:outlineLvl w:val="2"/>
-        <w:rPr>
-          <w:rFonts w:eastAsia="MS Gothic"/>
-          <w:b/>
-          <w:bCs/>
-          <w:color w:val="000000"/>
-          <w:szCs w:val="22"/>
-          <w:lang w:val="en-US" w:eastAsia="en-US"/>
-        </w:rPr>
-      </w:pPr>
-      <w:bookmarkStart w:id="24" w:name="_Toc244104019"/>
-      <w:bookmarkStart w:id="25" w:name="_Toc244108860"/>
-      <w:r>
-        <w:rPr>
-          <w:rFonts w:eastAsia="MS Gothic"/>
-          <w:b/>
-          <w:bCs/>
-          <w:color w:val="000000"/>
-          <w:szCs w:val="22"/>
-          <w:lang w:val="en-US" w:eastAsia="en-US"/>
-        </w:rPr>
-        <w:t>1.5.5 National Commission for Colleges of Education</w:t>
-      </w:r>
-      <w:bookmarkEnd w:id="24"/>
-      <w:bookmarkEnd w:id="25"/>
-    </w:p>
-    <w:p>
-      <w:pPr>
-        <w:spacing w:after="80" w:line="360" w:lineRule="auto"/>
-        <w:jc w:val="both"/>
-        <w:rPr>
-          <w:szCs w:val="22"/>
-          <w:lang w:val="en-US" w:eastAsia="en-US"/>
-        </w:rPr>
-      </w:pPr>
-      <w:r>
-        <w:rPr>
-          <w:szCs w:val="22"/>
-          <w:lang w:val="en-US" w:eastAsia="en-US"/>
-        </w:rPr>
-        <w:t>The Commission handles the establishment and accreditation of SIWES units in colleges of education and makes sure full-time coordinators are appointed. It reviews and approves the master and placement lists before sending them to the Fund, and works with the Fund to see that federal government policy is applied in the colleges.</w:t>
-      </w:r>
-    </w:p>
-    <w:p>
-      <w:pPr>
-        <w:keepNext/>
-        <w:keepLines/>
-        <w:spacing w:before="120" w:after="80" w:line="360" w:lineRule="auto"/>
-        <w:outlineLvl w:val="2"/>
-        <w:rPr>
-          <w:rFonts w:eastAsia="MS Gothic"/>
-          <w:b/>
-          <w:bCs/>
-          <w:color w:val="000000"/>
-          <w:szCs w:val="22"/>
-          <w:lang w:val="en-US" w:eastAsia="en-US"/>
-        </w:rPr>
-      </w:pPr>
-      <w:bookmarkStart w:id="26" w:name="_Toc244104020"/>
-      <w:bookmarkStart w:id="27" w:name="_Toc244108861"/>
-      <w:r>
-        <w:rPr>
-          <w:rFonts w:eastAsia="MS Gothic"/>
-          <w:b/>
-          <w:bCs/>
-          <w:color w:val="000000"/>
-          <w:szCs w:val="22"/>
-          <w:lang w:val="en-US" w:eastAsia="en-US"/>
-        </w:rPr>
-        <w:t>1.5.6 The Institutions</w:t>
-      </w:r>
-      <w:bookmarkEnd w:id="26"/>
-      <w:bookmarkEnd w:id="27"/>
-    </w:p>
-    <w:p>
-      <w:pPr>
-        <w:spacing w:after="80" w:line="360" w:lineRule="auto"/>
-        <w:jc w:val="both"/>
-        <w:rPr>
-          <w:szCs w:val="22"/>
-          <w:lang w:val="en-US" w:eastAsia="en-US"/>
-        </w:rPr>
-      </w:pPr>
-      <w:r>
-        <w:rPr>
-          <w:szCs w:val="22"/>
-          <w:lang w:val="en-US" w:eastAsia="en-US"/>
-        </w:rPr>
-        <w:t>The institution sets up a SIWES coordination unit with enough staff and money and with a separate account, and it takes the matriculation numbers, telephone numbers and bank details of students at registration. It submits the master and placement lists to the Fund not later than 31 March of each SIWES year, applies the approved job specifications to accredited courses and awards credit units following the federal minimum academic guidelines. It also supervises students where they are attached, signs their log books, and submits the completed ITF form 8 to the nearest office of the Fund.</w:t>
-      </w:r>
-    </w:p>
-    <w:p>
-      <w:pPr>
-        <w:keepNext/>
-        <w:keepLines/>
-        <w:spacing w:before="120" w:after="80" w:line="360" w:lineRule="auto"/>
-        <w:outlineLvl w:val="2"/>
-        <w:rPr>
-          <w:rFonts w:eastAsia="MS Gothic"/>
-          <w:b/>
-          <w:bCs/>
-          <w:color w:val="000000"/>
-          <w:szCs w:val="22"/>
-          <w:lang w:val="en-US" w:eastAsia="en-US"/>
-        </w:rPr>
-      </w:pPr>
-      <w:bookmarkStart w:id="28" w:name="_Toc244104021"/>
-      <w:bookmarkStart w:id="29" w:name="_Toc244108862"/>
-      <w:r>
-        <w:rPr>
-          <w:rFonts w:eastAsia="MS Gothic"/>
-          <w:b/>
-          <w:bCs/>
-          <w:color w:val="000000"/>
-          <w:szCs w:val="22"/>
-          <w:lang w:val="en-US" w:eastAsia="en-US"/>
-        </w:rPr>
-        <w:t>1.5.7 Employers of Labour</w:t>
-      </w:r>
-      <w:bookmarkEnd w:id="28"/>
-      <w:bookmarkEnd w:id="29"/>
-    </w:p>
-    <w:p>
-      <w:pPr>
-        <w:spacing w:after="80" w:line="360" w:lineRule="auto"/>
-        <w:jc w:val="both"/>
-        <w:rPr>
-          <w:szCs w:val="22"/>
-          <w:lang w:val="en-US" w:eastAsia="en-US"/>
-        </w:rPr>
-      </w:pPr>
-      <w:r>
-        <w:rPr>
-          <w:szCs w:val="22"/>
-          <w:lang w:val="en-US" w:eastAsia="en-US"/>
-        </w:rPr>
-        <w:t>Employers work with the institutions to prepare job specifications, and accept students for attachment as the Act provides. They provide welfare such as medication and hospitalisation while the student is attached, take part in assessment by filling the ITF form 8 and the log books, allow students to use their facilities, and appoint an industry-based supervisor.</w:t>
-      </w:r>
-    </w:p>
-    <w:p>
-      <w:pPr>
-        <w:spacing w:after="120"/>
-        <w:jc w:val="both"/>
-      </w:pPr>
-    </w:p>
-    <w:p>
-      <w:pPr>
-        <w:pStyle w:val="Heading2"/>
       </w:pPr>
       <w:bookmarkStart w:id="30" w:name="_Toc244108863"/>
       <w:r>
-        <w:t>1.6 Objectives of SIWES</w:t>
+        <w:t>1.5 Objectives of SIWES</w:t>
       </w:r>
       <w:bookmarkEnd w:id="30"/>
     </w:p>
@@ -5659,7 +5333,7 @@
         <w:pStyle w:val="Heading2"/>
       </w:pPr>
       <w:r>
-        <w:t>1.7 Benefits of Industrial Training to Students</w:t>
+        <w:t>1.6 Benefits of Industrial Training to Students</w:t>
       </w:r>
     </w:p>
     <w:p>
@@ -23886,6 +23560,16 @@
 </file>
 
 <file path=word/footer3.xml><?xml version="1.0" encoding="utf-8"?>
+<w:ftr xmlns:m="http://schemas.openxmlformats.org/officeDocument/2006/math" xmlns:mc="http://schemas.openxmlformats.org/markup-compatibility/2006" xmlns:mo="http://schemas.microsoft.com/office/mac/office/2008/main" xmlns:mv="urn:schemas-microsoft-com:mac:vml" xmlns:o="urn:schemas-microsoft-com:office:office" xmlns:r="http://schemas.openxmlformats.org/officeDocument/2006/relationships" xmlns:v="urn:schemas-microsoft-com:vml" xmlns:w10="urn:schemas-microsoft-com:office:word" xmlns:w14="http://schemas.microsoft.com/office/word/2010/wordml" xmlns:w="http://schemas.openxmlformats.org/wordprocessingml/2006/main" xmlns:wne="http://schemas.microsoft.com/office/word/2006/wordml" xmlns:wp14="http://schemas.microsoft.com/office/word/2010/wordprocessingDrawing" xmlns:wp="http://schemas.openxmlformats.org/drawingml/2006/wordprocessingDrawing" xmlns:wpc="http://schemas.microsoft.com/office/word/2010/wordprocessingCanvas" xmlns:wpg="http://schemas.microsoft.com/office/word/2010/wordprocessingGroup" xmlns:wpi="http://schemas.microsoft.com/office/word/2010/wordprocessingInk" xmlns:wps="http://schemas.microsoft.com/office/word/2010/wordprocessingShape" mc:Ignorable="w14 wp14">
+  <w:p>
+    <w:pPr>
+      <w:pStyle w:val="Footer"/>
+    </w:pPr>
+  </w:p>
+</w:ftr>
+</file>
+
+<file path=word/footer4.xml><?xml version="1.0" encoding="utf-8"?>
 <w:ftr xmlns:m="http://schemas.openxmlformats.org/officeDocument/2006/math" xmlns:mc="http://schemas.openxmlformats.org/markup-compatibility/2006" xmlns:mo="http://schemas.microsoft.com/office/mac/office/2008/main" xmlns:mv="urn:schemas-microsoft-com:mac:vml" xmlns:o="urn:schemas-microsoft-com:office:office" xmlns:r="http://schemas.openxmlformats.org/officeDocument/2006/relationships" xmlns:v="urn:schemas-microsoft-com:vml" xmlns:w10="urn:schemas-microsoft-com:office:word" xmlns:w14="http://schemas.microsoft.com/office/word/2010/wordml" xmlns:w="http://schemas.openxmlformats.org/wordprocessingml/2006/main" xmlns:wne="http://schemas.microsoft.com/office/word/2006/wordml" xmlns:wp14="http://schemas.microsoft.com/office/word/2010/wordprocessingDrawing" xmlns:wp="http://schemas.openxmlformats.org/drawingml/2006/wordprocessingDrawing" xmlns:wpc="http://schemas.microsoft.com/office/word/2010/wordprocessingCanvas" xmlns:wpg="http://schemas.microsoft.com/office/word/2010/wordprocessingGroup" xmlns:wpi="http://schemas.microsoft.com/office/word/2010/wordprocessingInk" xmlns:wps="http://schemas.microsoft.com/office/word/2010/wordprocessingShape" mc:Ignorable="w14 wp14">
   <w:p>
     <w:pPr>

</xml_diff>